<commit_message>
Update Recovery Note template
</commit_message>
<xml_diff>
--- a/recovery_note_template.docx
+++ b/recovery_note_template.docx
@@ -54,7 +54,13 @@
         <w:rPr>
           <w:rFonts w:ascii="Arial" w:hAnsi="Arial"/>
         </w:rPr>
-        <w:t>Infrastructure Technology Services </w:t>
+        <w:t xml:space="preserve">Infrastructure Technology </w:t>
+      </w:r>
+      <w:r>
+        <w:rPr>
+          <w:rFonts w:ascii="Arial" w:hAnsi="Arial"/>
+        </w:rPr>
+        <w:t>Operations Division</w:t>
       </w:r>
       <w:r>
         <w:rPr>
@@ -142,8 +148,56 @@
       <w:r>
         <w:rPr>
           <w:rFonts w:ascii="Arial" w:hAnsi="Arial"/>
-        </w:rPr>
-        <w:t>Services technologiques d'infrastructure</w:t>
+          <w:lang w:val="en-CA"/>
+        </w:rPr>
+        <w:t xml:space="preserve">Division des </w:t>
+      </w:r>
+      <w:proofErr w:type="spellStart"/>
+      <w:r>
+        <w:rPr>
+          <w:rFonts w:ascii="Arial" w:hAnsi="Arial"/>
+          <w:lang w:val="en-CA"/>
+        </w:rPr>
+        <w:t>opérations</w:t>
+      </w:r>
+      <w:proofErr w:type="spellEnd"/>
+      <w:r>
+        <w:rPr>
+          <w:rFonts w:ascii="Arial" w:hAnsi="Arial"/>
+          <w:lang w:val="en-CA"/>
+        </w:rPr>
+        <w:t xml:space="preserve"> </w:t>
+      </w:r>
+      <w:proofErr w:type="spellStart"/>
+      <w:r>
+        <w:rPr>
+          <w:rFonts w:ascii="Arial" w:hAnsi="Arial"/>
+          <w:lang w:val="en-CA"/>
+        </w:rPr>
+        <w:t>technologiques</w:t>
+      </w:r>
+      <w:proofErr w:type="spellEnd"/>
+      <w:r>
+        <w:rPr>
+          <w:rFonts w:ascii="Arial" w:hAnsi="Arial"/>
+          <w:lang w:val="en-CA"/>
+        </w:rPr>
+        <w:t xml:space="preserve"> de </w:t>
+      </w:r>
+      <w:proofErr w:type="spellStart"/>
+      <w:r>
+        <w:rPr>
+          <w:rFonts w:ascii="Arial" w:hAnsi="Arial"/>
+          <w:lang w:val="en-CA"/>
+        </w:rPr>
+        <w:t>l’infrastructure</w:t>
+      </w:r>
+      <w:proofErr w:type="spellEnd"/>
+      <w:r>
+        <w:rPr>
+          <w:rFonts w:ascii="Arial" w:hAnsi="Arial"/>
+        </w:rPr>
+        <w:t xml:space="preserve"> </w:t>
       </w:r>
     </w:p>
     <w:p>
@@ -1711,7 +1765,6 @@
           <w:lang w:val="fr-CA"/>
         </w:rPr>
       </w:pPr>
-      <w:proofErr w:type="spellStart"/>
       <w:r>
         <w:rPr>
           <w:rFonts w:asciiTheme="minorHAnsi" w:hAnsiTheme="minorHAnsi" w:cstheme="minorHAnsi"/>
@@ -1726,7 +1779,6 @@
         </w:rPr>
         <w:t>n</w:t>
       </w:r>
-      <w:proofErr w:type="spellEnd"/>
       <w:r>
         <w:rPr>
           <w:rFonts w:asciiTheme="minorHAnsi" w:hAnsiTheme="minorHAnsi" w:cstheme="minorHAnsi"/>
@@ -3498,6 +3550,30 @@
 </file>
 
 <file path=customXml/item1.xml><?xml version="1.0" encoding="utf-8"?>
+<b:Sources xmlns:b="http://schemas.openxmlformats.org/officeDocument/2006/bibliography" xmlns="http://schemas.openxmlformats.org/officeDocument/2006/bibliography" SelectedStyle="/APASixthEditionOfficeOnline.xsl" StyleName="APA" Version="6"/>
+</file>
+
+<file path=customXml/item2.xml><?xml version="1.0" encoding="utf-8"?>
+<p:properties xmlns:p="http://schemas.microsoft.com/office/2006/metadata/properties" xmlns:xsi="http://www.w3.org/2001/XMLSchema-instance" xmlns:pc="http://schemas.microsoft.com/office/infopath/2007/PartnerControls">
+  <documentManagement>
+    <lcf76f155ced4ddcb4097134ff3c332f xmlns="ed3ab280-ca97-4b91-8786-90f137bc60a2">
+      <Terms xmlns="http://schemas.microsoft.com/office/infopath/2007/PartnerControls"/>
+    </lcf76f155ced4ddcb4097134ff3c332f>
+    <TaxCatchAll xmlns="f630ab0f-4bd0-409b-92d7-24eae7810306" xsi:nil="true"/>
+  </documentManagement>
+</p:properties>
+</file>
+
+<file path=customXml/item3.xml><?xml version="1.0" encoding="utf-8"?>
+<?mso-contentType ?>
+<FormTemplates xmlns="http://schemas.microsoft.com/sharepoint/v3/contenttype/forms">
+  <Display>DocumentLibraryForm</Display>
+  <Edit>DocumentLibraryForm</Edit>
+  <New>DocumentLibraryForm</New>
+</FormTemplates>
+</file>
+
+<file path=customXml/item4.xml><?xml version="1.0" encoding="utf-8"?>
 <ct:contentTypeSchema xmlns:ct="http://schemas.microsoft.com/office/2006/metadata/contentType" xmlns:ma="http://schemas.microsoft.com/office/2006/metadata/properties/metaAttributes" ct:_="" ma:_="" ma:contentTypeName="Document" ma:contentTypeID="0x01010097F4E1D9AED9174799216B0C742F52EC" ma:contentTypeVersion="22" ma:contentTypeDescription="Create a new document." ma:contentTypeScope="" ma:versionID="3edb0144771b44ad8b94a7b5a1112a81">
   <xsd:schema xmlns:xsd="http://www.w3.org/2001/XMLSchema" xmlns:xs="http://www.w3.org/2001/XMLSchema" xmlns:p="http://schemas.microsoft.com/office/2006/metadata/properties" xmlns:ns2="ed3ab280-ca97-4b91-8786-90f137bc60a2" xmlns:ns3="f630ab0f-4bd0-409b-92d7-24eae7810306" targetNamespace="http://schemas.microsoft.com/office/2006/metadata/properties" ma:root="true" ma:fieldsID="b970f6a4e8e0976dbee2883cf5099787" ns2:_="" ns3:_="">
     <xsd:import namespace="ed3ab280-ca97-4b91-8786-90f137bc60a2"/>
@@ -3752,31 +3828,34 @@
 </ct:contentTypeSchema>
 </file>
 
-<file path=customXml/item2.xml><?xml version="1.0" encoding="utf-8"?>
-<?mso-contentType ?>
-<FormTemplates xmlns="http://schemas.microsoft.com/sharepoint/v3/contenttype/forms">
-  <Display>DocumentLibraryForm</Display>
-  <Edit>DocumentLibraryForm</Edit>
-  <New>DocumentLibraryForm</New>
-</FormTemplates>
+<file path=customXml/itemProps1.xml><?xml version="1.0" encoding="utf-8"?>
+<ds:datastoreItem xmlns:ds="http://schemas.openxmlformats.org/officeDocument/2006/customXml" ds:itemID="{C92F3C83-5E60-44AB-8C32-414C5F9994D5}">
+  <ds:schemaRefs>
+    <ds:schemaRef ds:uri="http://schemas.openxmlformats.org/officeDocument/2006/bibliography"/>
+  </ds:schemaRefs>
+</ds:datastoreItem>
 </file>
 
-<file path=customXml/item3.xml><?xml version="1.0" encoding="utf-8"?>
-<p:properties xmlns:p="http://schemas.microsoft.com/office/2006/metadata/properties" xmlns:xsi="http://www.w3.org/2001/XMLSchema-instance" xmlns:pc="http://schemas.microsoft.com/office/infopath/2007/PartnerControls">
-  <documentManagement>
-    <lcf76f155ced4ddcb4097134ff3c332f xmlns="ed3ab280-ca97-4b91-8786-90f137bc60a2">
-      <Terms xmlns="http://schemas.microsoft.com/office/infopath/2007/PartnerControls"/>
-    </lcf76f155ced4ddcb4097134ff3c332f>
-    <TaxCatchAll xmlns="f630ab0f-4bd0-409b-92d7-24eae7810306" xsi:nil="true"/>
-  </documentManagement>
-</p:properties>
+<file path=customXml/itemProps2.xml><?xml version="1.0" encoding="utf-8"?>
+<ds:datastoreItem xmlns:ds="http://schemas.openxmlformats.org/officeDocument/2006/customXml" ds:itemID="{18D68FB9-04A4-420E-ADF3-1B617D1B9E24}">
+  <ds:schemaRefs>
+    <ds:schemaRef ds:uri="http://schemas.microsoft.com/office/2006/metadata/properties"/>
+    <ds:schemaRef ds:uri="http://schemas.microsoft.com/office/infopath/2007/PartnerControls"/>
+    <ds:schemaRef ds:uri="ed3ab280-ca97-4b91-8786-90f137bc60a2"/>
+    <ds:schemaRef ds:uri="f630ab0f-4bd0-409b-92d7-24eae7810306"/>
+  </ds:schemaRefs>
+</ds:datastoreItem>
 </file>
 
-<file path=customXml/item4.xml><?xml version="1.0" encoding="utf-8"?>
-<b:Sources xmlns:b="http://schemas.openxmlformats.org/officeDocument/2006/bibliography" xmlns="http://schemas.openxmlformats.org/officeDocument/2006/bibliography" SelectedStyle="/APASixthEditionOfficeOnline.xsl" StyleName="APA" Version="6"/>
+<file path=customXml/itemProps3.xml><?xml version="1.0" encoding="utf-8"?>
+<ds:datastoreItem xmlns:ds="http://schemas.openxmlformats.org/officeDocument/2006/customXml" ds:itemID="{EA399833-2412-4947-83AE-8001C07F6576}">
+  <ds:schemaRefs>
+    <ds:schemaRef ds:uri="http://schemas.microsoft.com/sharepoint/v3/contenttype/forms"/>
+  </ds:schemaRefs>
+</ds:datastoreItem>
 </file>
 
-<file path=customXml/itemProps1.xml><?xml version="1.0" encoding="utf-8"?>
+<file path=customXml/itemProps4.xml><?xml version="1.0" encoding="utf-8"?>
 <ds:datastoreItem xmlns:ds="http://schemas.openxmlformats.org/officeDocument/2006/customXml" ds:itemID="{EC09CDEB-2C92-48FE-8146-078A7EE9BD56}">
   <ds:schemaRefs>
     <ds:schemaRef ds:uri="http://schemas.microsoft.com/office/2006/metadata/contentType"/>
@@ -3795,33 +3874,6 @@
 </ds:datastoreItem>
 </file>
 
-<file path=customXml/itemProps2.xml><?xml version="1.0" encoding="utf-8"?>
-<ds:datastoreItem xmlns:ds="http://schemas.openxmlformats.org/officeDocument/2006/customXml" ds:itemID="{EA399833-2412-4947-83AE-8001C07F6576}">
-  <ds:schemaRefs>
-    <ds:schemaRef ds:uri="http://schemas.microsoft.com/sharepoint/v3/contenttype/forms"/>
-  </ds:schemaRefs>
-</ds:datastoreItem>
-</file>
-
-<file path=customXml/itemProps3.xml><?xml version="1.0" encoding="utf-8"?>
-<ds:datastoreItem xmlns:ds="http://schemas.openxmlformats.org/officeDocument/2006/customXml" ds:itemID="{18D68FB9-04A4-420E-ADF3-1B617D1B9E24}">
-  <ds:schemaRefs>
-    <ds:schemaRef ds:uri="http://schemas.microsoft.com/office/2006/metadata/properties"/>
-    <ds:schemaRef ds:uri="http://schemas.microsoft.com/office/infopath/2007/PartnerControls"/>
-    <ds:schemaRef ds:uri="ed3ab280-ca97-4b91-8786-90f137bc60a2"/>
-    <ds:schemaRef ds:uri="f630ab0f-4bd0-409b-92d7-24eae7810306"/>
-  </ds:schemaRefs>
-</ds:datastoreItem>
-</file>
-
-<file path=customXml/itemProps4.xml><?xml version="1.0" encoding="utf-8"?>
-<ds:datastoreItem xmlns:ds="http://schemas.openxmlformats.org/officeDocument/2006/customXml" ds:itemID="{C92F3C83-5E60-44AB-8C32-414C5F9994D5}">
-  <ds:schemaRefs>
-    <ds:schemaRef ds:uri="http://schemas.openxmlformats.org/officeDocument/2006/bibliography"/>
-  </ds:schemaRefs>
-</ds:datastoreItem>
-</file>
-
 <file path=docMetadata/LabelInfo.xml><?xml version="1.0" encoding="utf-8"?>
 <clbl:labelList xmlns:clbl="http://schemas.microsoft.com/office/2020/mipLabelMetadata">
   <clbl:label id="{034a106e-6316-442c-ad35-738afd673d2b}" enabled="1" method="Standard" siteId="{cddc1229-ac2a-4b97-b78a-0e5cacb5865c}" removed="0"/>

</xml_diff>

<commit_message>
Update recovery note template document
</commit_message>
<xml_diff>
--- a/recovery_note_template.docx
+++ b/recovery_note_template.docx
@@ -1765,34 +1765,6 @@
           <w:lang w:val="fr-CA"/>
         </w:rPr>
       </w:pPr>
-      <w:r>
-        <w:rPr>
-          <w:rFonts w:asciiTheme="minorHAnsi" w:hAnsiTheme="minorHAnsi" w:cstheme="minorHAnsi"/>
-          <w:lang w:val="fr-CA"/>
-        </w:rPr>
-        <w:t>Colum</w:t>
-      </w:r>
-      <w:r>
-        <w:rPr>
-          <w:rFonts w:asciiTheme="minorHAnsi" w:hAnsiTheme="minorHAnsi" w:cstheme="minorHAnsi"/>
-          <w:lang w:val="fr-CA"/>
-        </w:rPr>
-        <w:t>n</w:t>
-      </w:r>
-      <w:r>
-        <w:rPr>
-          <w:rFonts w:asciiTheme="minorHAnsi" w:hAnsiTheme="minorHAnsi" w:cstheme="minorHAnsi"/>
-          <w:lang w:val="fr-CA"/>
-        </w:rPr>
-        <w:t xml:space="preserve"> </w:t>
-      </w:r>
-      <w:r>
-        <w:rPr>
-          <w:rFonts w:asciiTheme="minorHAnsi" w:hAnsiTheme="minorHAnsi" w:cstheme="minorHAnsi"/>
-          <w:lang w:val="fr-CA"/>
-        </w:rPr>
-        <w:t>X</w:t>
-      </w:r>
     </w:p>
     <w:p>
       <w:pPr>
@@ -3550,10 +3522,6 @@
 </file>
 
 <file path=customXml/item1.xml><?xml version="1.0" encoding="utf-8"?>
-<b:Sources xmlns:b="http://schemas.openxmlformats.org/officeDocument/2006/bibliography" xmlns="http://schemas.openxmlformats.org/officeDocument/2006/bibliography" SelectedStyle="/APASixthEditionOfficeOnline.xsl" StyleName="APA" Version="6"/>
-</file>
-
-<file path=customXml/item2.xml><?xml version="1.0" encoding="utf-8"?>
 <p:properties xmlns:p="http://schemas.microsoft.com/office/2006/metadata/properties" xmlns:xsi="http://www.w3.org/2001/XMLSchema-instance" xmlns:pc="http://schemas.microsoft.com/office/infopath/2007/PartnerControls">
   <documentManagement>
     <lcf76f155ced4ddcb4097134ff3c332f xmlns="ed3ab280-ca97-4b91-8786-90f137bc60a2">
@@ -3564,16 +3532,11 @@
 </p:properties>
 </file>
 
-<file path=customXml/item3.xml><?xml version="1.0" encoding="utf-8"?>
-<?mso-contentType ?>
-<FormTemplates xmlns="http://schemas.microsoft.com/sharepoint/v3/contenttype/forms">
-  <Display>DocumentLibraryForm</Display>
-  <Edit>DocumentLibraryForm</Edit>
-  <New>DocumentLibraryForm</New>
-</FormTemplates>
+<file path=customXml/item2.xml><?xml version="1.0" encoding="utf-8"?>
+<b:Sources xmlns:b="http://schemas.openxmlformats.org/officeDocument/2006/bibliography" xmlns="http://schemas.openxmlformats.org/officeDocument/2006/bibliography" SelectedStyle="/APASixthEditionOfficeOnline.xsl" StyleName="APA" Version="6"/>
 </file>
 
-<file path=customXml/item4.xml><?xml version="1.0" encoding="utf-8"?>
+<file path=customXml/item3.xml><?xml version="1.0" encoding="utf-8"?>
 <ct:contentTypeSchema xmlns:ct="http://schemas.microsoft.com/office/2006/metadata/contentType" xmlns:ma="http://schemas.microsoft.com/office/2006/metadata/properties/metaAttributes" ct:_="" ma:_="" ma:contentTypeName="Document" ma:contentTypeID="0x01010097F4E1D9AED9174799216B0C742F52EC" ma:contentTypeVersion="22" ma:contentTypeDescription="Create a new document." ma:contentTypeScope="" ma:versionID="3edb0144771b44ad8b94a7b5a1112a81">
   <xsd:schema xmlns:xsd="http://www.w3.org/2001/XMLSchema" xmlns:xs="http://www.w3.org/2001/XMLSchema" xmlns:p="http://schemas.microsoft.com/office/2006/metadata/properties" xmlns:ns2="ed3ab280-ca97-4b91-8786-90f137bc60a2" xmlns:ns3="f630ab0f-4bd0-409b-92d7-24eae7810306" targetNamespace="http://schemas.microsoft.com/office/2006/metadata/properties" ma:root="true" ma:fieldsID="b970f6a4e8e0976dbee2883cf5099787" ns2:_="" ns3:_="">
     <xsd:import namespace="ed3ab280-ca97-4b91-8786-90f137bc60a2"/>
@@ -3828,15 +3791,16 @@
 </ct:contentTypeSchema>
 </file>
 
-<file path=customXml/itemProps1.xml><?xml version="1.0" encoding="utf-8"?>
-<ds:datastoreItem xmlns:ds="http://schemas.openxmlformats.org/officeDocument/2006/customXml" ds:itemID="{C92F3C83-5E60-44AB-8C32-414C5F9994D5}">
-  <ds:schemaRefs>
-    <ds:schemaRef ds:uri="http://schemas.openxmlformats.org/officeDocument/2006/bibliography"/>
-  </ds:schemaRefs>
-</ds:datastoreItem>
+<file path=customXml/item4.xml><?xml version="1.0" encoding="utf-8"?>
+<?mso-contentType ?>
+<FormTemplates xmlns="http://schemas.microsoft.com/sharepoint/v3/contenttype/forms">
+  <Display>DocumentLibraryForm</Display>
+  <Edit>DocumentLibraryForm</Edit>
+  <New>DocumentLibraryForm</New>
+</FormTemplates>
 </file>
 
-<file path=customXml/itemProps2.xml><?xml version="1.0" encoding="utf-8"?>
+<file path=customXml/itemProps1.xml><?xml version="1.0" encoding="utf-8"?>
 <ds:datastoreItem xmlns:ds="http://schemas.openxmlformats.org/officeDocument/2006/customXml" ds:itemID="{18D68FB9-04A4-420E-ADF3-1B617D1B9E24}">
   <ds:schemaRefs>
     <ds:schemaRef ds:uri="http://schemas.microsoft.com/office/2006/metadata/properties"/>
@@ -3847,15 +3811,15 @@
 </ds:datastoreItem>
 </file>
 
-<file path=customXml/itemProps3.xml><?xml version="1.0" encoding="utf-8"?>
-<ds:datastoreItem xmlns:ds="http://schemas.openxmlformats.org/officeDocument/2006/customXml" ds:itemID="{EA399833-2412-4947-83AE-8001C07F6576}">
+<file path=customXml/itemProps2.xml><?xml version="1.0" encoding="utf-8"?>
+<ds:datastoreItem xmlns:ds="http://schemas.openxmlformats.org/officeDocument/2006/customXml" ds:itemID="{C92F3C83-5E60-44AB-8C32-414C5F9994D5}">
   <ds:schemaRefs>
-    <ds:schemaRef ds:uri="http://schemas.microsoft.com/sharepoint/v3/contenttype/forms"/>
+    <ds:schemaRef ds:uri="http://schemas.openxmlformats.org/officeDocument/2006/bibliography"/>
   </ds:schemaRefs>
 </ds:datastoreItem>
 </file>
 
-<file path=customXml/itemProps4.xml><?xml version="1.0" encoding="utf-8"?>
+<file path=customXml/itemProps3.xml><?xml version="1.0" encoding="utf-8"?>
 <ds:datastoreItem xmlns:ds="http://schemas.openxmlformats.org/officeDocument/2006/customXml" ds:itemID="{EC09CDEB-2C92-48FE-8146-078A7EE9BD56}">
   <ds:schemaRefs>
     <ds:schemaRef ds:uri="http://schemas.microsoft.com/office/2006/metadata/contentType"/>
@@ -3874,6 +3838,14 @@
 </ds:datastoreItem>
 </file>
 
+<file path=customXml/itemProps4.xml><?xml version="1.0" encoding="utf-8"?>
+<ds:datastoreItem xmlns:ds="http://schemas.openxmlformats.org/officeDocument/2006/customXml" ds:itemID="{EA399833-2412-4947-83AE-8001C07F6576}">
+  <ds:schemaRefs>
+    <ds:schemaRef ds:uri="http://schemas.microsoft.com/sharepoint/v3/contenttype/forms"/>
+  </ds:schemaRefs>
+</ds:datastoreItem>
+</file>
+
 <file path=docMetadata/LabelInfo.xml><?xml version="1.0" encoding="utf-8"?>
 <clbl:labelList xmlns:clbl="http://schemas.microsoft.com/office/2020/mipLabelMetadata">
   <clbl:label id="{034a106e-6316-442c-ad35-738afd673d2b}" enabled="1" method="Standard" siteId="{cddc1229-ac2a-4b97-b78a-0e5cacb5865c}" removed="0"/>

</xml_diff>